<commit_message>
Szerzőlista és affiliációk a címoldalon
Hét szerző felső indexes intézmény-hozzárendeléssel, négy affiliáció,
a szerzői útmutató formátuma szerint. Levelező szerző: Szili Károly.

Az 1. és 3. affiliációnál a hivatalos intézménynevet és a helységnevet
kiegészítettük (Széchenyi István Egyetem, Győr; SZTE Szent-Györgyi Albert
Orvostudományi Kar, Szeged). A 2. affiliációt nem oldottuk fel, mert a
rövidítés több doktori iskolára is illeszkedhet.

A címoldal dőlt megjegyzésben jelzi, mi hiányzik még: a "dr."
megjelölések, az intézményvezetők neve, a 2. affiliáció teljes neve és
helységneve, valamint a levelezési cím.

Javítva egy hiba a build_docx.py-ban: a modulszintű for ciklus 'szoveg'
változója felülírta a kézirat szövegét tartalmazó globálist.

Co-Authored-By: Claude Opus 5 <noreply@anthropic.com>
</commit_message>
<xml_diff>
--- a/biralatok/3_javitasi_naplo.docx
+++ b/biralatok/3_javitasi_naplo.docx
@@ -289,7 +289,7 @@
         <w:rPr>
           <w:sz w:val="17"/>
         </w:rPr>
-        <w:t>5. | Címoldal kitöltendő | **részben** | A szerző neve és e-mail címe beírva; a munkahely és a levelezési cím továbbra is a szerzőre vár (ezeket nem ismerjük).</w:t>
+        <w:t>5. | Címoldal kitöltendő | **nagyrészt** | A hét szerző és a négy affiliáció felső indexes hozzárendeléssel beírva; a levelező szerző megnevezve. Még hiányzik: a „dr.” megjelölések, az intézményvezetők neve, a 2. affiliáció teljes hivatalos neve és helységneve, a levelezési cím.</w:t>
       </w:r>
     </w:p>
     <w:p>
@@ -1027,6 +1027,220 @@
         <w:t xml:space="preserve"> (határ 4000), így mintegy 500 szó tartalék maradt.</w:t>
       </w:r>
     </w:p>
+    <w:p>
+      <w:pPr>
+        <w:spacing w:before="240"/>
+      </w:pPr>
+      <w:r>
+        <w:rPr>
+          <w:b/>
+          <w:sz w:val="24"/>
+        </w:rPr>
+        <w:t>G. Szerzőlista és affiliációk</w:t>
+      </w:r>
+    </w:p>
+    <w:p>
+      <w:r>
+        <w:rPr>
+          <w:b w:val="0"/>
+        </w:rPr>
+        <w:t>A címoldal elkészült. Hét szerző, felső indexes intézmény-hozzárendeléssel, a szerzői útmutató formátuma szerint:</w:t>
+      </w:r>
+    </w:p>
+    <w:p>
+      <w:r>
+        <w:rPr>
+          <w:b w:val="0"/>
+        </w:rPr>
+      </w:r>
+      <w:r>
+        <w:rPr>
+          <w:b/>
+        </w:rPr>
+        <w:t>Dézsi Csilla</w:t>
+      </w:r>
+      <w:r>
+        <w:rPr>
+          <w:b w:val="0"/>
+        </w:rPr>
+        <w:t xml:space="preserve">^1,2,3,4^ · </w:t>
+      </w:r>
+      <w:r>
+        <w:rPr>
+          <w:b/>
+        </w:rPr>
+        <w:t>Gulyás-Oldal Viktor</w:t>
+      </w:r>
+      <w:r>
+        <w:rPr>
+          <w:b w:val="0"/>
+        </w:rPr>
+        <w:t xml:space="preserve">^1,2^ · </w:t>
+      </w:r>
+      <w:r>
+        <w:rPr>
+          <w:b/>
+        </w:rPr>
+        <w:t>Gálóczi Imre</w:t>
+      </w:r>
+      <w:r>
+        <w:rPr>
+          <w:b w:val="0"/>
+        </w:rPr>
+        <w:t xml:space="preserve">^1,2^ · </w:t>
+      </w:r>
+      <w:r>
+        <w:rPr>
+          <w:b/>
+        </w:rPr>
+        <w:t>Lábodi László</w:t>
+      </w:r>
+      <w:r>
+        <w:rPr>
+          <w:b w:val="0"/>
+        </w:rPr>
+        <w:t xml:space="preserve">^4^ · </w:t>
+      </w:r>
+      <w:r>
+        <w:rPr>
+          <w:b/>
+        </w:rPr>
+        <w:t>Marusin Ildikó</w:t>
+      </w:r>
+      <w:r>
+        <w:rPr>
+          <w:b w:val="0"/>
+        </w:rPr>
+        <w:t xml:space="preserve">^4^ · </w:t>
+      </w:r>
+      <w:r>
+        <w:rPr>
+          <w:b/>
+        </w:rPr>
+        <w:t>Szili Károly</w:t>
+      </w:r>
+      <w:r>
+        <w:rPr>
+          <w:b w:val="0"/>
+        </w:rPr>
+        <w:t xml:space="preserve">^1,2,3,4^ · </w:t>
+      </w:r>
+      <w:r>
+        <w:rPr>
+          <w:b/>
+        </w:rPr>
+        <w:t>Nagy Sándor</w:t>
+      </w:r>
+      <w:r>
+        <w:rPr>
+          <w:b w:val="0"/>
+        </w:rPr>
+        <w:t>^1,2^</w:t>
+      </w:r>
+    </w:p>
+    <w:p>
+      <w:r>
+        <w:rPr>
+          <w:b w:val="0"/>
+        </w:rPr>
+        <w:t>1. Széchenyi István Egyetem, Szülészeti és Nőgyógyászati Tanszék, Győr</w:t>
+      </w:r>
+    </w:p>
+    <w:p>
+      <w:r>
+        <w:rPr>
+          <w:b w:val="0"/>
+        </w:rPr>
+        <w:t>2. Széchenyi István Egyetem, RGDI — *a teljes hivatalos név és a helységnév kiegészítendő*</w:t>
+      </w:r>
+    </w:p>
+    <w:p>
+      <w:r>
+        <w:rPr>
+          <w:b w:val="0"/>
+        </w:rPr>
+        <w:t>3. Szegedi Tudományegyetem, Szent-Györgyi Albert Orvostudományi Kar, Szülészeti és Nőgyógyászati Klinika, Szeged</w:t>
+      </w:r>
+    </w:p>
+    <w:p>
+      <w:r>
+        <w:rPr>
+          <w:b w:val="0"/>
+        </w:rPr>
+        <w:t>4. S.O.S. 24 Kft. – 48. Családorvosi Rendelő, Szeged</w:t>
+      </w:r>
+    </w:p>
+    <w:p>
+      <w:r>
+        <w:rPr>
+          <w:b w:val="0"/>
+        </w:rPr>
+        <w:t xml:space="preserve">Levelező szerző: </w:t>
+      </w:r>
+      <w:r>
+        <w:rPr>
+          <w:b/>
+        </w:rPr>
+        <w:t>Szili Károly</w:t>
+      </w:r>
+      <w:r>
+        <w:rPr>
+          <w:b w:val="0"/>
+        </w:rPr>
+        <w:t>.</w:t>
+      </w:r>
+    </w:p>
+    <w:p>
+      <w:r>
+        <w:rPr>
+          <w:b w:val="0"/>
+        </w:rPr>
+        <w:t xml:space="preserve">Az 1. és a 3. affiliációnál a hivatalos intézménynevet és a helységnevet kiegészítettük (Széchenyi </w:t>
+      </w:r>
+      <w:r>
+        <w:rPr>
+          <w:b/>
+        </w:rPr>
+        <w:t>István</w:t>
+      </w:r>
+      <w:r>
+        <w:rPr>
+          <w:b w:val="0"/>
+        </w:rPr>
+        <w:t xml:space="preserve"> Egyetem, Győr; SZTE </w:t>
+      </w:r>
+      <w:r>
+        <w:rPr>
+          <w:b/>
+        </w:rPr>
+        <w:t>Szent-Györgyi Albert Orvostudományi Kar</w:t>
+      </w:r>
+      <w:r>
+        <w:rPr>
+          <w:b w:val="0"/>
+        </w:rPr>
+        <w:t>, Szeged), mert az útmutató a pontos hivatalos megnevezést és a helységnevet is kéri. A 2. affiliációt („SZE: RGDI") nem oldottuk fel, mert a rövidítés több doktori iskolára is illeszkedhet — ezt a szerzőknek kell megadniuk.</w:t>
+      </w:r>
+    </w:p>
+    <w:p>
+      <w:r>
+        <w:rPr>
+          <w:b w:val="0"/>
+        </w:rPr>
+      </w:r>
+      <w:r>
+        <w:rPr>
+          <w:b/>
+        </w:rPr>
+        <w:t>A címoldalon még hiányzó, a szerzőktől érkező adatok:</w:t>
+      </w:r>
+      <w:r>
+        <w:rPr>
+          <w:b w:val="0"/>
+        </w:rPr>
+        <w:t xml:space="preserve"> a „dr." megjelölés azoknál a szerzőknél, ahol indokolt; minden intézménynél az intézményvezető neve; a 2. affiliáció teljes neve és helységneve; a levelezési cím. Ezt a kézirat a címoldalon dőlt betűs megjegyzésben is jelzi.</w:t>
+      </w:r>
+    </w:p>
     <w:sectPr>
       <w:pgSz w:w="12240" w:h="15840"/>
       <w:pgMar w:top="1417" w:right="1134" w:bottom="1417" w:left="1134" w:header="720" w:footer="720" w:gutter="0"/>

</xml_diff>

<commit_message>
Címoldal: dr. megjelölések, intézményvezetők, levelezési cím
Szerzők: a szerzői útmutató mintája szerint a "dr." a név után áll;
Gálóczi Imre kivételével minden szerzőnél.

Intézményvezetők
  1  Nagy Sándor dr., PhD (tanszékvezető)
  2  Prof. Dr. habil. Vasa — a teljes név még hiányzik
  3  Prof. Dr. habil. Várbíró Szabolcs (igazgató)
  4  Szili Károly dr., PhD (vezető)

Levelezési cím: Széchenyi István Egyetem, 9026 Győr, Egyetem tér 1.

Tipográfiai egységesítés: Ph.D./Ph.D -> PhD, Dr. habil -> Dr. habil.

Egyetlen nyitott adat maradt a címoldalon: a 2. affiliáció teljes
hivatalos megnevezése és helységneve, valamint a doktori iskola
vezetőjének teljes neve.

Co-Authored-By: Claude Opus 5 <noreply@anthropic.com>
</commit_message>
<xml_diff>
--- a/biralatok/3_javitasi_naplo.docx
+++ b/biralatok/3_javitasi_naplo.docx
@@ -289,7 +289,7 @@
         <w:rPr>
           <w:sz w:val="17"/>
         </w:rPr>
-        <w:t>5. | Címoldal kitöltendő | **nagyrészt** | A hét szerző és a négy affiliáció felső indexes hozzárendeléssel beírva; a levelező szerző megnevezve. Még hiányzik: a „dr.” megjelölések, az intézményvezetők neve, a 2. affiliáció teljes hivatalos neve és helységneve, a levelezési cím.</w:t>
+        <w:t>5. | Címoldal kitöltendő | **lezárva (egy adat hiányzik)** | A hét szerző „dr.” megjelöléssel, a négy affiliáció intézményvezetővel, a levelező szerző címmel és e-maillel. Egyedül a 2. affiliáció teljes hivatalos neve, helységneve és a doktori iskola vezetőjének teljes neve hiányzik.</w:t>
       </w:r>
     </w:p>
     <w:p>
@@ -1232,13 +1232,64 @@
         <w:rPr>
           <w:b/>
         </w:rPr>
-        <w:t>A címoldalon még hiányzó, a szerzőktől érkező adatok:</w:t>
+        <w:t>A címoldal elkészült.</w:t>
       </w:r>
       <w:r>
         <w:rPr>
           <w:b w:val="0"/>
         </w:rPr>
-        <w:t xml:space="preserve"> a „dr." megjelölés azoknál a szerzőknél, ahol indokolt; minden intézménynél az intézményvezető neve; a 2. affiliáció teljes neve és helységneve; a levelezési cím. Ezt a kézirat a címoldalon dőlt betűs megjegyzésben is jelzi.</w:t>
+        <w:t xml:space="preserve"> A szerzői útmutató mintája szerint a „dr." a név után áll; Gálóczi Imre kivételével minden szerzőnél szerepel. Intézményvezetők: 1. Nagy Sándor dr., PhD (tanszékvezető) · 2. Prof. Dr. habil. Vasa *(teljes név kiegészítendő)* · 3. Prof. Dr. habil. Várbíró Szabolcs (igazgató) · 4. Szili Károly dr., PhD (vezető). Levelezési cím: Széchenyi István Egyetem, 9026 Győr, Egyetem tér 1.</w:t>
+      </w:r>
+    </w:p>
+    <w:p>
+      <w:r>
+        <w:rPr>
+          <w:b w:val="0"/>
+        </w:rPr>
+        <w:t xml:space="preserve">Két tipográfiai egységesítés: a „Ph.D."/„Ph.D" alakot mindenhol </w:t>
+      </w:r>
+      <w:r>
+        <w:rPr>
+          <w:b/>
+        </w:rPr>
+        <w:t>PhD</w:t>
+      </w:r>
+      <w:r>
+        <w:rPr>
+          <w:b w:val="0"/>
+        </w:rPr>
+        <w:t xml:space="preserve">-re, a „Dr. habil" alakot </w:t>
+      </w:r>
+      <w:r>
+        <w:rPr>
+          <w:b/>
+        </w:rPr>
+        <w:t>Dr. habil.</w:t>
+      </w:r>
+      <w:r>
+        <w:rPr>
+          <w:b w:val="0"/>
+        </w:rPr>
+        <w:t>-ra hoztuk, hogy a címoldal önmagán belül következetes legyen.</w:t>
+      </w:r>
+    </w:p>
+    <w:p>
+      <w:r>
+        <w:rPr>
+          <w:b w:val="0"/>
+        </w:rPr>
+      </w:r>
+      <w:r>
+        <w:rPr>
+          <w:b/>
+        </w:rPr>
+        <w:t>Egyetlen hiányzó adat maradt:</w:t>
+      </w:r>
+      <w:r>
+        <w:rPr>
+          <w:b w:val="0"/>
+        </w:rPr>
+        <w:t xml:space="preserve"> a 2. affiliáció teljes hivatalos megnevezése és helységneve, valamint a doktori iskola vezetőjének teljes neve. Ezt a kézirat a címoldalon dőlt betűs megjegyzésben is jelzi.</w:t>
       </w:r>
     </w:p>
     <w:sectPr>

</xml_diff>

<commit_message>
Címoldal lezárva: Vasa László, RGDI feloldva, levelező szerző megerősítve
- 2. affiliáció: Prof. Dr. habil. Vasa László; az RGDI rövidítés
  Regionális- és Gazdaságtudományi Doktori Iskola alakban feloldva,
  Győr helységnévvel
- levelező szerző megerősítve: Szili Károly dr.

A címoldal dőlt sora immár egyetlen dolgot kér: a doktori iskola
hivatalos megnevezésének ellenőrzését beküldés előtt, mert ez a
kézirat egyetlen levezetett (nem közölt) adata.

Co-Authored-By: Claude Opus 5 <noreply@anthropic.com>
</commit_message>
<xml_diff>
--- a/biralatok/3_javitasi_naplo.docx
+++ b/biralatok/3_javitasi_naplo.docx
@@ -289,7 +289,7 @@
         <w:rPr>
           <w:sz w:val="17"/>
         </w:rPr>
-        <w:t>5. | Címoldal kitöltendő | **lezárva (egy adat hiányzik)** | A hét szerző „dr.” megjelöléssel, a négy affiliáció intézményvezetővel, a levelező szerző címmel és e-maillel. Egyedül a 2. affiliáció teljes hivatalos neve, helységneve és a doktori iskola vezetőjének teljes neve hiányzik.</w:t>
+        <w:t>5. | Címoldal kitöltendő | **lezárva** | A hét szerző „dr.” megjelöléssel, mind a négy affiliáció intézményvezetővel és helységnévvel, a levelező szerző (Szili Károly dr.) címmel és e-maillel.</w:t>
       </w:r>
     </w:p>
     <w:p>
@@ -1151,7 +1151,7 @@
         <w:rPr>
           <w:b w:val="0"/>
         </w:rPr>
-        <w:t>2. Széchenyi István Egyetem, RGDI — *a teljes hivatalos név és a helységnév kiegészítendő*</w:t>
+        <w:t>2. Széchenyi István Egyetem, Regionális- és Gazdaságtudományi Doktori Iskola (RGDI), Győr</w:t>
       </w:r>
     </w:p>
     <w:p>
@@ -1238,7 +1238,7 @@
         <w:rPr>
           <w:b w:val="0"/>
         </w:rPr>
-        <w:t xml:space="preserve"> A szerzői útmutató mintája szerint a „dr." a név után áll; Gálóczi Imre kivételével minden szerzőnél szerepel. Intézményvezetők: 1. Nagy Sándor dr., PhD (tanszékvezető) · 2. Prof. Dr. habil. Vasa *(teljes név kiegészítendő)* · 3. Prof. Dr. habil. Várbíró Szabolcs (igazgató) · 4. Szili Károly dr., PhD (vezető). Levelezési cím: Széchenyi István Egyetem, 9026 Győr, Egyetem tér 1.</w:t>
+        <w:t xml:space="preserve"> A szerzői útmutató mintája szerint a „dr." a név után áll; Gálóczi Imre kivételével minden szerzőnél szerepel. Intézményvezetők: 1. Nagy Sándor dr., PhD (tanszékvezető) · 2. Prof. Dr. habil. Vasa László · 3. Prof. Dr. habil. Várbíró Szabolcs (igazgató) · 4. Szili Károly dr., PhD (vezető). Levelezési cím: Széchenyi István Egyetem, 9026 Győr, Egyetem tér 1.</w:t>
       </w:r>
     </w:p>
     <w:p>
@@ -1278,18 +1278,19 @@
         <w:rPr>
           <w:b w:val="0"/>
         </w:rPr>
+        <w:t xml:space="preserve">A 2. affiliációnál az „RGDI" rövidítést </w:t>
       </w:r>
       <w:r>
         <w:rPr>
           <w:b/>
         </w:rPr>
-        <w:t>Egyetlen hiányzó adat maradt:</w:t>
+        <w:t>Regionális- és Gazdaságtudományi Doktori Iskola</w:t>
       </w:r>
       <w:r>
         <w:rPr>
           <w:b w:val="0"/>
         </w:rPr>
-        <w:t xml:space="preserve"> a 2. affiliáció teljes hivatalos megnevezése és helységneve, valamint a doktori iskola vezetőjének teljes neve. Ezt a kézirat a címoldalon dőlt betűs megjegyzésben is jelzi.</w:t>
+        <w:t xml:space="preserve"> alakban oldottuk fel, Győr helységnévvel — ez következik abból, hogy ugyanannak az egyetemnek a doktori iskolájáról van szó, és a megadott iskolavezető is ehhez illeszkedik. Mivel ez a kézirat egyetlen olyan adata, amely levezetésen és nem közlésen alapul, a címoldal dőlt betűs sora kéri a beküldés előtti ellenőrzését.</w:t>
       </w:r>
     </w:p>
     <w:sectPr>

</xml_diff>